<commit_message>
feat: mejora formato de memorándums y cierre módulo notas
- ajuste de formato de tablas en memorándums:
  - aplicación de bordes en celdas (sin uso de negrita)
  - mejora visual consistente con formato esperado

- correcciones finales módulo preparacion_notas:
  - uso de columnas Teo/Lab como fuente de secciones
  - separación correcta entre cátedra y laboratorio
  - eliminación de dependencias de nombres de hojas para datos

- integración completa flujo:
  originales → preparación → notas → memorándums
</commit_message>
<xml_diff>
--- a/templates/molde_notas_TAAA.docx
+++ b/templates/molde_notas_TAAA.docx
@@ -15,13 +15,7 @@
         <w:rPr>
           <w:u w:val="none"/>
         </w:rPr>
-        <w:t>MEMORÁNDUM &lt;</w:t>
-      </w:r>
-      <w:r>
-        <w:rPr>
-          <w:u w:val="none"/>
-        </w:rPr>
-        <w:t>anio&gt;</w:t>
+        <w:t>MEMORÁNDUM &lt;anio&gt;</w:t>
       </w:r>
     </w:p>
     <w:p>
@@ -211,10 +205,10 @@
         <w:gridCol w:w="390"/>
         <w:gridCol w:w="2010"/>
         <w:gridCol w:w="1290"/>
-        <w:gridCol w:w="2151"/>
-        <w:gridCol w:w="1619"/>
-        <w:gridCol w:w="1565"/>
-        <w:gridCol w:w="613"/>
+        <w:gridCol w:w="2610"/>
+        <w:gridCol w:w="1350"/>
+        <w:gridCol w:w="1200"/>
+        <w:gridCol w:w="788"/>
       </w:tblGrid>
       <w:tr>
         <w:trPr/>
@@ -292,7 +286,7 @@
         </w:tc>
         <w:tc>
           <w:tcPr>
-            <w:tcW w:w="2151" w:type="dxa"/>
+            <w:tcW w:w="2610" w:type="dxa"/>
             <w:tcBorders>
               <w:top w:val="single" w:sz="2" w:space="0" w:color="000000"/>
               <w:start w:val="single" w:sz="2" w:space="0" w:color="000000"/>
@@ -316,7 +310,7 @@
         </w:tc>
         <w:tc>
           <w:tcPr>
-            <w:tcW w:w="1619" w:type="dxa"/>
+            <w:tcW w:w="1350" w:type="dxa"/>
             <w:tcBorders>
               <w:top w:val="single" w:sz="2" w:space="0" w:color="000000"/>
               <w:start w:val="single" w:sz="2" w:space="0" w:color="000000"/>
@@ -340,7 +334,7 @@
         </w:tc>
         <w:tc>
           <w:tcPr>
-            <w:tcW w:w="1565" w:type="dxa"/>
+            <w:tcW w:w="1200" w:type="dxa"/>
             <w:tcBorders>
               <w:top w:val="single" w:sz="2" w:space="0" w:color="000000"/>
               <w:start w:val="single" w:sz="2" w:space="0" w:color="000000"/>
@@ -364,7 +358,7 @@
         </w:tc>
         <w:tc>
           <w:tcPr>
-            <w:tcW w:w="613" w:type="dxa"/>
+            <w:tcW w:w="788" w:type="dxa"/>
             <w:tcBorders>
               <w:top w:val="single" w:sz="2" w:space="0" w:color="000000"/>
               <w:start w:val="single" w:sz="2" w:space="0" w:color="000000"/>

</xml_diff>